<commit_message>
Update features, documentation and add expert system
</commit_message>
<xml_diff>
--- a/docs/HTTT-Nhóm 14 -REPORT.docx
+++ b/docs/HTTT-Nhóm 14 -REPORT.docx
@@ -43,7 +43,7 @@
           <v:shape id="_x0000_s1026" type="#_x0000_t75" style="position:absolute;left:0;text-align:left;margin-left:-14.7pt;margin-top:-30.55pt;width:520.05pt;height:702.05pt;z-index:-251658752" fillcolor="window">
             <v:imagedata r:id="rId8" o:title=""/>
           </v:shape>
-          <o:OLEObject Type="Embed" ProgID="Word.Picture.8" ShapeID="_x0000_s1026" DrawAspect="Content" ObjectID="_1841630173" r:id="rId9"/>
+          <o:OLEObject Type="Embed" ProgID="Word.Picture.8" ShapeID="_x0000_s1026" DrawAspect="Content" ObjectID="_1841836997" r:id="rId9"/>
         </w:object>
       </w:r>
       <w:r>
@@ -4556,11 +4556,8 @@
     </w:p>
     <w:p>
       <w:pPr>
-        <w:pStyle w:val="Heading3"/>
-        <w:spacing w:line="360" w:lineRule="auto"/>
         <w:rPr>
           <w:rFonts w:ascii="Times New Roman" w:hAnsi="Times New Roman" w:cs="Times New Roman"/>
-          <w:color w:val="auto"/>
           <w:sz w:val="28"/>
           <w:szCs w:val="28"/>
         </w:rPr>
@@ -4569,7 +4566,6 @@
       <w:r>
         <w:rPr>
           <w:rFonts w:ascii="Times New Roman" w:hAnsi="Times New Roman" w:cs="Times New Roman"/>
-          <w:color w:val="auto"/>
           <w:sz w:val="28"/>
           <w:szCs w:val="28"/>
         </w:rPr>
@@ -5118,13 +5114,28 @@
     </w:tbl>
     <w:p>
       <w:pPr>
-        <w:spacing w:line="360" w:lineRule="auto"/>
         <w:rPr>
           <w:rFonts w:ascii="Times New Roman" w:hAnsi="Times New Roman" w:cs="Times New Roman"/>
           <w:sz w:val="28"/>
           <w:szCs w:val="28"/>
         </w:rPr>
       </w:pPr>
+      <w:r>
+        <w:rPr>
+          <w:rFonts w:ascii="Times New Roman" w:hAnsi="Times New Roman" w:cs="Times New Roman"/>
+          <w:sz w:val="28"/>
+          <w:szCs w:val="28"/>
+        </w:rPr>
+        <w:br/>
+      </w:r>
+      <w:r>
+        <w:rPr>
+          <w:rFonts w:ascii="Times New Roman" w:hAnsi="Times New Roman" w:cs="Times New Roman"/>
+          <w:sz w:val="28"/>
+          <w:szCs w:val="28"/>
+        </w:rPr>
+        <w:t>Mamdani có tính giải thích rất cao và gần với tư duy ngôn ngữ của con người. Tuy nhiên hệ thống của nhóm cần tích hợp với scoring, uncertainty index và decision routing theo thời gian thực, nên nhóm lựa chọn Zero-order Sugeno FIS để tối ưu phần tính toán, đồng thời vẫn giữ membership functions và luật ngôn ngữ để đảm bảo khả năng giải thích (XAI)</w:t>
+      </w:r>
     </w:p>
     <w:p>
       <w:pPr>
@@ -10731,7 +10742,6 @@
   <w:style w:type="character" w:default="1" w:styleId="DefaultParagraphFont">
     <w:name w:val="Default Paragraph Font"/>
     <w:uiPriority w:val="1"/>
-    <w:semiHidden/>
     <w:unhideWhenUsed/>
   </w:style>
   <w:style w:type="table" w:default="1" w:styleId="TableNormal">

</xml_diff>